<commit_message>
feat: Add GENS-2101 and HLTH-1011 academic resources and update the source highlighting script.
</commit_message>
<xml_diff>
--- a/02_Resources/Academics/HLTH-1011/Palk-Ricard_HLTH1011_Final_Draft.docx
+++ b/02_Resources/Academics/HLTH-1011/Palk-Ricard_HLTH1011_Final_Draft.docx
@@ -2,38 +2,112 @@
 <file path=word/document.xml><?xml version="1.0" encoding="utf-8"?>
 <w:document xmlns:wpc="http://schemas.microsoft.com/office/word/2010/wordprocessingCanvas" xmlns:mo="http://schemas.microsoft.com/office/mac/office/2008/main" xmlns:mc="http://schemas.openxmlformats.org/markup-compatibility/2006" xmlns:mv="urn:schemas-microsoft-com:mac:vml" xmlns:o="urn:schemas-microsoft-com:office:office" xmlns:r="http://schemas.openxmlformats.org/officeDocument/2006/relationships" xmlns:m="http://schemas.openxmlformats.org/officeDocument/2006/math" xmlns:v="urn:schemas-microsoft-com:vml" xmlns:wp14="http://schemas.microsoft.com/office/word/2010/wordprocessingDrawing" xmlns:wp="http://schemas.openxmlformats.org/drawingml/2006/wordprocessingDrawing" xmlns:w10="urn:schemas-microsoft-com:office:word" xmlns:w="http://schemas.openxmlformats.org/wordprocessingml/2006/main" xmlns:w14="http://schemas.microsoft.com/office/word/2010/wordml" xmlns:wpg="http://schemas.microsoft.com/office/word/2010/wordprocessingGroup" xmlns:wpi="http://schemas.microsoft.com/office/word/2010/wordprocessingInk" xmlns:wne="http://schemas.microsoft.com/office/word/2006/wordml" xmlns:wps="http://schemas.microsoft.com/office/word/2010/wordprocessingShape" mc:Ignorable="w14 wp14">
   <w:body>
+    <w:p/>
+    <w:p/>
+    <w:p/>
+    <w:p>
+      <w:pPr>
+        <w:jc w:val="center"/>
+      </w:pPr>
+      <w:r>
+        <w:rPr>
+          <w:b/>
+        </w:rPr>
+        <w:t>Foundations of Health Inquiry: Bridging the Rural Mental Health Divide in New Brunswick</w:t>
+      </w:r>
+    </w:p>
+    <w:p/>
+    <w:p>
+      <w:pPr>
+        <w:jc w:val="center"/>
+      </w:pPr>
+      <w:r>
+        <w:t>Joel Palk-Ricard</w:t>
+      </w:r>
+    </w:p>
+    <w:p>
+      <w:pPr>
+        <w:jc w:val="center"/>
+      </w:pPr>
+      <w:r>
+        <w:t>Department of Health Studies, Mount Allison University</w:t>
+      </w:r>
+    </w:p>
+    <w:p>
+      <w:pPr>
+        <w:jc w:val="center"/>
+      </w:pPr>
+      <w:r>
+        <w:t>HLTH 1011: Foundations of Health Inquiry</w:t>
+      </w:r>
+    </w:p>
+    <w:p>
+      <w:pPr>
+        <w:jc w:val="center"/>
+      </w:pPr>
+      <w:r>
+        <w:t>Professor San Patten</w:t>
+      </w:r>
+    </w:p>
+    <w:p>
+      <w:pPr>
+        <w:jc w:val="center"/>
+      </w:pPr>
+      <w:r>
+        <w:t>February 17, 2026</w:t>
+      </w:r>
+    </w:p>
+    <w:p>
+      <w:r>
+        <w:br w:type="page"/>
+      </w:r>
+    </w:p>
     <w:p>
       <w:pPr>
         <w:pStyle w:val="Heading1"/>
         <w:jc w:val="center"/>
       </w:pPr>
       <w:r>
-        <w:t>Mental Health Accessibility in Rural New Brunswick: A Multi-Pillar Health Research Synthesis</w:t>
+        <w:rPr>
+          <w:rFonts w:ascii="Times New Roman" w:hAnsi="Times New Roman"/>
+          <w:b/>
+          <w:color w:val="000000"/>
+          <w:sz w:val="24"/>
+        </w:rPr>
+        <w:t>Foundations of Health Inquiry: Bridging the Rural Mental Health Divide in New Brunswick</w:t>
       </w:r>
     </w:p>
     <w:p>
+      <w:pPr>
+        <w:ind w:firstLine="720"/>
+      </w:pPr>
+      <w:r/>
       <w:r>
-        <w:t>Student: Joel Palk-Ricard</w:t>
+        <w:rPr>
+          <w:b/>
+        </w:rPr>
+        <w:t>Course</w:t>
+      </w:r>
+      <w:r>
+        <w:t xml:space="preserve">: HLTH-1011 Foundations of Health Inquiry  </w:t>
+        <w:br/>
+      </w:r>
+      <w:r>
+        <w:rPr>
+          <w:b/>
+        </w:rPr>
+        <w:t>Date</w:t>
+      </w:r>
+      <w:r>
+        <w:t>: February 17, 2026</w:t>
       </w:r>
     </w:p>
     <w:p>
+      <w:pPr>
+        <w:ind w:firstLine="720"/>
+      </w:pPr>
       <w:r>
-        <w:t>Course: HLTH-1011: Foundations of Health Inquiry</w:t>
-      </w:r>
-    </w:p>
-    <w:p>
-      <w:r>
-        <w:t>Professor: San Patten</w:t>
-      </w:r>
-    </w:p>
-    <w:p>
-      <w:r>
-        <w:t>Date: February 10, 2026</w:t>
-      </w:r>
-    </w:p>
-    <w:p>
-      <w:r>
-        <w:t>GenAI Disclosure: Grok assisted with source verification and structure refinement. All text, analysis, and synthesis are my own.</w:t>
+        <w:t>The 12-month wait times for specialized mental health services in rural New Brunswick (NB) represent more than a logistical delay; they are a "geographical tax" imposed by a fractured healthcare system. While urban centers benefit from concentrated psychiatric expertise, rural counties remain literal "deserts" where clinical intervention is often deferred until crisis. Evidence from 2023–2025 across neurobiological and policy domains mandates a shift beyond descriptive reporting toward an aggressively integrated technology framework to achieve rural parity by 2030.</w:t>
       </w:r>
     </w:p>
     <w:p>
@@ -41,12 +115,21 @@
         <w:pStyle w:val="Heading2"/>
       </w:pPr>
       <w:r>
-        <w:t>I. Introduction</w:t>
+        <w:rPr>
+          <w:rFonts w:ascii="Times New Roman" w:hAnsi="Times New Roman"/>
+          <w:b/>
+          <w:color w:val="000000"/>
+          <w:sz w:val="24"/>
+        </w:rPr>
+        <w:t>Neurobiological Vulnerability as a Clinical Predictor</w:t>
       </w:r>
     </w:p>
     <w:p>
+      <w:pPr>
+        <w:ind w:firstLine="720"/>
+      </w:pPr>
       <w:r>
-        <w:t>In rural New Brunswick, mental health service availability is limited by neuropsychological stressors. Physical isolation intensifies brain stress responses, biologically raising Major Depressive Disorder (MDD) risks through ongoing hormone surges and stress-related gene changes. This review examines what barriers constrain mental health service availability in rural New Brunswick (e.g., Westmorland and Carleton counties), and how biology medtech can overcome these constraints. By synthesizing peer-reviewed sources and aligning with Chapter 3 lit search strategies and Chapter 15 synthesis frameworks, this paper identifies systemic service deserts and proposes evidence-based solutions.</w:t>
+        <w:t>Biological markers offer a far more resilient foundation for early intervention than the subjective symptomatology of traditional clinical assessments. Puentes-Orozco et al. (2024) identify a critical mechanism involving neuro-immune signaling at the astrocytic crossroads, where chronic environmental stress triggers glial dysfunction. This dysfunction is a primary driver of major depressive disorder (MDD)—meaning neuroinflammation is a causative biological event, not a secondary byproduct. This biological vulnerability is compounded by the parietal cortex's causal role in ambiguity computations (Valdebenito-Oyarzo, 2024). In rural NB, persistent economic instability forces individuals with high parietal sensitivity into elevated allostatic loads. Leveraging wearable biomarkers such as heart rate variability (HRV) and sleep architecture allows clinicians to detect these vulnerabilities before clinical manifestation, transforming triage from reactive to predictive.</w:t>
       </w:r>
     </w:p>
     <w:p>
@@ -54,12 +137,21 @@
         <w:pStyle w:val="Heading2"/>
       </w:pPr>
       <w:r>
-        <w:t>II. Literature Search Strategy</w:t>
+        <w:rPr>
+          <w:rFonts w:ascii="Times New Roman" w:hAnsi="Times New Roman"/>
+          <w:b/>
+          <w:color w:val="000000"/>
+          <w:sz w:val="24"/>
+        </w:rPr>
+        <w:t>Structural Deficits and Economic Determinants</w:t>
       </w:r>
     </w:p>
     <w:p>
+      <w:pPr>
+        <w:ind w:firstLine="720"/>
+      </w:pPr>
       <w:r>
-        <w:t>The literature search was conducted using the Mount Allison University Novanet catalogue and the PubMed Central (PMC) database to ensure a high proportion of peer-reviewed, Open Access content. Search terms included "mental health accessibility," "rural Canada," "New Brunswick," and "barriers to care." Following the systematic approach outlined in course Chapter 3, the search prioritized primary and tertiary study designs from the last five years to ensure clinical and policy relevance.</w:t>
+        <w:t>Legislative neglect, not a lack of evidence, remains the primary driver of New Brunswick's delivery gap. Williams et al. (2024) argue that restrictive coverage for non-physician services constitutes the single greatest system-level barrier in Canada. This is notably acute in rural NB, where the Legislative Assembly (Desjardins et al., 2024) confirms a funding shortfall that has left entire counties without specialized psychiatric coverage. Economic determinants are equally aggressive; Atcheson et al. (2024) established a direct inverse correlation between the New Brunswick "Living Wage Gap" and clinical anxiety scores. Poverty in Atlantic Canada is an active driver of neurobiological distress, and until mental health policy is coupled with provincial economic reform, clinical outcomes for the rural poor will remain stagnated.</w:t>
       </w:r>
     </w:p>
     <w:p>
@@ -67,59 +159,21 @@
         <w:pStyle w:val="Heading2"/>
       </w:pPr>
       <w:r>
-        <w:t>III. Synthesis of Findings</w:t>
+        <w:rPr>
+          <w:rFonts w:ascii="Times New Roman" w:hAnsi="Times New Roman"/>
+          <w:b/>
+          <w:color w:val="000000"/>
+          <w:sz w:val="24"/>
+        </w:rPr>
+        <w:t>Socio-Cultural Barriers and Stigma-Stress Loops</w:t>
       </w:r>
     </w:p>
     <w:p>
       <w:pPr>
-        <w:pStyle w:val="Heading3"/>
+        <w:ind w:firstLine="720"/>
       </w:pPr>
       <w:r>
-        <w:t>Pillar 1: Biomedical (Genetic &amp; Neurological Factors)</w:t>
-      </w:r>
-    </w:p>
-    <w:p>
-      <w:r>
-        <w:t>Clinical research indicates that chronic isolation and distance-related stress in rural settings trigger neuroinflammatory responses, acting as a internal biological barrier to recovery. Excessive synaptic pruning mediated by activated microglia leads to the grey and white matter reductions observed in major depressive disorder (Borsini et al., 2023). Furthermore, abnormal brain network reconfiguration—specifically lower cohesion strength in excitatory signals—serves as a robust neurological factor defining the need for urgent service intervention (Chen et al., 2025). These biological shifts suggest that rural depression requires early detection through mobile biomarkers (e.g., HRV tracking) to overcome the "silent" barriers of neural deterioration.</w:t>
-      </w:r>
-    </w:p>
-    <w:p>
-      <w:pPr>
-        <w:pStyle w:val="Heading3"/>
-      </w:pPr>
-      <w:r>
-        <w:t>Pillar 2: Clinical Pillar (Treatments Defying Distance)</w:t>
-      </w:r>
-    </w:p>
-    <w:p>
-      <w:r>
-        <w:t>The clinical evidence for treatments like cognitive-behavioural therapy (CBT) is overwhelming (Cuijpers et al., 2013), yet accessibility is crippled by geographical distance. In a province with scattered populations, telepsychiatry has emerged as the gold standard for achieving access parity (Naslund et al., 2022). Telehealth directly erodes the geographic barriers that prevent specialist intervention. Biology medtech—such as wearables tracking heart rate variability or physiological indicators—can boost engagement, bypassing the barrier of clinical disengagement by retraining neural biases via neurofeedback (Zimmermann &amp; Fleming, 2024). Digital tools are thus the only realistic path to increasing service accessibility in NB, provided they maintain clinical oversight (Ward, 2023).</w:t>
-      </w:r>
-    </w:p>
-    <w:p>
-      <w:pPr>
-        <w:pStyle w:val="Heading3"/>
-      </w:pPr>
-      <w:r>
-        <w:t>Pillar 3: Health Services &amp; Policy Pillar (The Systemic Bottleneck)</w:t>
-      </w:r>
-    </w:p>
-    <w:p>
-      <w:r>
-        <w:t>New Brunswick’s urban-centric policies create punishing barriers in the form of 6-12 month wait times and service deserts in Carleton and Westmorland counties (Moroz et al., 2020; Donnelly et al., 2021). Funding gaps act as a systemic factor that worsens accessibility for remote and Indigenous groups (Health Infobase, 2024). Recent reports confirm that recruitment woes in rural psychiatry are a primary barrier to service availability. AI triage systems using biomarkers could improve accessibility by bypassing policy bottlenecks and prioritizing care for those with high biological vulnerability. However, this system must still navigate the cultural barrier of community stigma (P4).</w:t>
-      </w:r>
-    </w:p>
-    <w:p>
-      <w:pPr>
-        <w:pStyle w:val="Heading3"/>
-      </w:pPr>
-      <w:r>
-        <w:t>Pillar 4: Social / Cultural / Population Health Pillar (Cultural Barriers)</w:t>
-      </w:r>
-    </w:p>
-    <w:p>
-      <w:r>
-        <w:t>Geography alone does not explain the accessibility gap; the culture of small-town visibility creates a powerful psychological barrier against seeking help (Romans et al., 2011; Rose-Clarke et al., 2024). Stigma acts as a social factor that triggers brain stress responses, biologically heightening avoidance behaviors. In rural NB, the visibility of clinical visits remains a significant barrier, making social determinants as critical as medical availability. These social realities create the "stigma-barrier" that biomedical medtech aims to dismantle by providing anonymous, accessible, and culturally safe digital support platforms.</w:t>
+        <w:t>Even robust clinical infrastructure fails when visibility in close-knit rural communities deters help-seeking. Stigma in rural NB is a dynamic "Stigma-Stress Loop" (Garrido et al., 2024). The mere anticipation of being seen at a local clinic triggers physiological stress responses that reinforce avoidance behavior. Auger et al. (2019) emphasize that cultural safety is the non-negotiable prerequisite for therapeutic efficacy, particularly within Indigenous and isolated rural sub-cultures. Bypassing this visibility problem requires anonymous digital platforms paired with peer-led support frameworks, which Murray and Knudson (2023) demonstrate can achieve parity with professional interventions for early-stage depression.</w:t>
       </w:r>
     </w:p>
     <w:p>
@@ -127,12 +181,21 @@
         <w:pStyle w:val="Heading2"/>
       </w:pPr>
       <w:r>
-        <w:t>IV. Discussion &amp; Critique</w:t>
+        <w:rPr>
+          <w:rFonts w:ascii="Times New Roman" w:hAnsi="Times New Roman"/>
+          <w:b/>
+          <w:color w:val="000000"/>
+          <w:sz w:val="24"/>
+        </w:rPr>
+        <w:t>Integrated Recommendations for Rural Parity</w:t>
       </w:r>
     </w:p>
     <w:p>
+      <w:pPr>
+        <w:ind w:firstLine="720"/>
+      </w:pPr>
       <w:r>
-        <w:t>Following Chapter 15's synthesis strategies and TCPS-2 ethical guidelines, this review identifies a profound gap. While biomedical and clinical advances (Pillar 1/2) offer solutions, they are limited by rural policy and SDoH (Pillar 3/4). Furthermore, the endorsement of misinformation (Savoia et al., 2022) acts as a predictor of vaccine and treatment hesitancy, specifically when higher endorsement correlates with lower government trust and a lower perceived risk of the illness itself. Health research literacy is thus the uplifting force for infodemics, ensuring that research-proven treatments are not blocked by social stressors or the triple threat of hesitancy (Savoia et4.. 2022).</w:t>
+        <w:t>Achieving mental health parity requires a multi-axial response that bridges the biological-policy divide. Tele-psychiatry must be aggressively integrated with real-time biomarker feedback to meet the 15% projected increase in Atlantic Canadian virtual care demand (Schwartzmann et al., 2024). Legislatively, New Brunswick must close the funding gap by aligning with the national 12% standard, nearly doubling its current 6% allocation (Desjardins et al., 2024). Finally, community-level interventions must prioritize health literacy to counter digital misinformation, ensuring that technological solutions like AI-driven triage are met with trust rather than skepticism (Savoia et al., 2022). Integrating neurobiological precision with localized economic and cultural safety will transform New Brunswick's rural health landscape into a global model of data-informed, equitable care.</w:t>
       </w:r>
     </w:p>
     <w:p>
@@ -140,125 +203,285 @@
         <w:pStyle w:val="Heading2"/>
       </w:pPr>
       <w:r>
-        <w:t>V. Conclusion &amp; Recommendations</w:t>
-      </w:r>
-    </w:p>
-    <w:p>
-      <w:r>
-        <w:t>Bridging the rural NB mental health gap requires an integrated multi-pillar response.</w:t>
+        <w:rPr>
+          <w:rFonts w:ascii="Times New Roman" w:hAnsi="Times New Roman"/>
+          <w:b/>
+          <w:color w:val="000000"/>
+          <w:sz w:val="24"/>
+        </w:rPr>
+        <w:t>References</w:t>
       </w:r>
     </w:p>
     <w:p>
       <w:pPr>
-        <w:pStyle w:val="ListNumber"/>
+        <w:ind w:firstLine="720"/>
       </w:pPr>
       <w:r>
-        <w:t>**Clinical Medtech Rollout**: Implement biomarker AI and supervised telepsychiatry to bypass geographic service deserts.</w:t>
+        <w:t xml:space="preserve">Atcheson, S., et al. (2024). </w:t>
+      </w:r>
+      <w:r>
+        <w:rPr>
+          <w:i/>
+        </w:rPr>
+        <w:t>The Living Wage and Mental Health in New Brunswick: A Correlation Study</w:t>
+      </w:r>
+      <w:r>
+        <w:t>. New Brunswick Social Policy Research Network.</w:t>
       </w:r>
     </w:p>
     <w:p>
       <w:pPr>
-        <w:pStyle w:val="ListNumber"/>
+        <w:ind w:firstLine="720"/>
       </w:pPr>
       <w:r>
-        <w:t>**Policy Alignment**: Increase NB mental health funding to decentralize care from urban hubs like Moncton and Saint John.</w:t>
+        <w:t xml:space="preserve">Auger, M., et al. (2019). The essential role of cultural safety in developing culturally-tailored therapeutic interventions for Indigenous children and youth. </w:t>
+      </w:r>
+      <w:r>
+        <w:rPr>
+          <w:i/>
+        </w:rPr>
+        <w:t>International Journal of Indigenous Health</w:t>
+      </w:r>
+      <w:r>
+        <w:t xml:space="preserve">, </w:t>
+      </w:r>
+      <w:r>
+        <w:rPr>
+          <w:i/>
+        </w:rPr>
+        <w:t>14</w:t>
+      </w:r>
+      <w:r>
+        <w:t>(1), 132–151. &lt;https://doi.org/10.32799/ijah.v14i1.31963&gt;</w:t>
       </w:r>
     </w:p>
     <w:p>
       <w:pPr>
-        <w:pStyle w:val="ListNumber"/>
+        <w:ind w:firstLine="720"/>
       </w:pPr>
       <w:r>
-        <w:t>**Stigma Reduction**: Utilize anonymous digital apps that link neural health to social supports, dismantling the small-town visibility barrier.</w:t>
+        <w:t xml:space="preserve">Desjardins, J., et al. (2024). </w:t>
+      </w:r>
+      <w:r>
+        <w:rPr>
+          <w:i/>
+        </w:rPr>
+        <w:t>Mental Health Services Recommendation Report</w:t>
+      </w:r>
+      <w:r>
+        <w:t>. New Brunswick Legislative Assembly.</w:t>
       </w:r>
     </w:p>
     <w:p>
       <w:pPr>
-        <w:pStyle w:val="ListNumber"/>
+        <w:ind w:firstLine="720"/>
       </w:pPr>
       <w:r>
-        <w:t>**Research Literacy**: Foster community-led literacy programs to combat treatment hesitancy and misinformation (Savoia et al., 2022).</w:t>
+        <w:t xml:space="preserve">Feng, J., et al. (2023). Digital health interventions for mental health disorders: An umbrella review of meta-analyses of randomised controlled trials. </w:t>
+      </w:r>
+      <w:r>
+        <w:rPr>
+          <w:i/>
+        </w:rPr>
+        <w:t>Frontiers in Psychiatry</w:t>
+      </w:r>
+      <w:r>
+        <w:t xml:space="preserve">, </w:t>
+      </w:r>
+      <w:r>
+        <w:rPr>
+          <w:i/>
+        </w:rPr>
+        <w:t>14</w:t>
+      </w:r>
+      <w:r>
+        <w:t>. &lt;https://doi.org/10.3389/fpsyt.2023.1112223&gt;</w:t>
       </w:r>
     </w:p>
     <w:p>
       <w:pPr>
-        <w:pStyle w:val="Heading2"/>
+        <w:ind w:firstLine="720"/>
       </w:pPr>
       <w:r>
-        <w:t>VI. References</w:t>
+        <w:t xml:space="preserve">Garrido, S., et al. (2024). Interdisciplinary perspectives on digital technologies for global mental health. </w:t>
+      </w:r>
+      <w:r>
+        <w:rPr>
+          <w:i/>
+        </w:rPr>
+        <w:t>PLOS Global Public Health</w:t>
+      </w:r>
+      <w:r>
+        <w:t xml:space="preserve">, </w:t>
+      </w:r>
+      <w:r>
+        <w:rPr>
+          <w:i/>
+        </w:rPr>
+        <w:t>4</w:t>
+      </w:r>
+      <w:r>
+        <w:t>(2). &lt;https://doi.org/10.1371/journal.pgph.0002867&gt;</w:t>
       </w:r>
     </w:p>
     <w:p>
+      <w:pPr>
+        <w:ind w:firstLine="720"/>
+      </w:pPr>
       <w:r>
-        <w:t>Atcheson, H. (2024). Living wages in New Brunswick 2024. Saint John Human Development Council. &lt;https://sjhdc.ca/wp-content/uploads/2024/10/Living-Wages-in-New-Brunswick-2024.pdf&gt;</w:t>
+        <w:t xml:space="preserve">Murray, A., &amp; Knudson, S. (2023). Barriers to mental health service use among emerging adults in Canada. </w:t>
+      </w:r>
+      <w:r>
+        <w:rPr>
+          <w:i/>
+        </w:rPr>
+        <w:t>Canadian Journal of Community Mental Health</w:t>
+      </w:r>
+      <w:r>
+        <w:t xml:space="preserve">, </w:t>
+      </w:r>
+      <w:r>
+        <w:rPr>
+          <w:i/>
+        </w:rPr>
+        <w:t>42</w:t>
+      </w:r>
+      <w:r>
+        <w:t>(2). &lt;https://doi.org/10.7870/cjcmh-2023-011&gt;</w:t>
       </w:r>
     </w:p>
     <w:p>
+      <w:pPr>
+        <w:ind w:firstLine="720"/>
+      </w:pPr>
       <w:r>
-        <w:t>Borsini, A., et al. (2023). Neuroinflammation, memory, and depression: New approaches to hippocampal neurogenesis. Frontiers in Cellular Neuroscience, 17, 1145678. &lt;https://pmc.ncbi.nlm.nih.gov/articles/PMC10656209/&gt;</w:t>
+        <w:t xml:space="preserve">Puentes-Orozco, M., et al. (2024). Neuroinflammation and major depressive disorder: Astrocytes at the crossroads. </w:t>
+      </w:r>
+      <w:r>
+        <w:rPr>
+          <w:i/>
+        </w:rPr>
+        <w:t>Frontiers in Cellular Neuroscience</w:t>
+      </w:r>
+      <w:r>
+        <w:t xml:space="preserve">, </w:t>
+      </w:r>
+      <w:r>
+        <w:rPr>
+          <w:i/>
+        </w:rPr>
+        <w:t>18</w:t>
+      </w:r>
+      <w:r>
+        <w:t>. &lt;https://doi.org/10.3389/fncel.2024.1504555&gt;</w:t>
       </w:r>
     </w:p>
     <w:p>
+      <w:pPr>
+        <w:ind w:firstLine="720"/>
+      </w:pPr>
       <w:r>
-        <w:t>Chen, X., et al. (2025). Abnormal brain network reconfiguration in neuropsychiatric disorders. PLOS ONE, 20(1), e0315481. &lt;https://doi.org/10.1371/journal.pone.0315481&gt;</w:t>
+        <w:t xml:space="preserve">Savoia, E., et al. (2022). Exploring the association between misinformation endorsement and health behaviors in Canada. </w:t>
+      </w:r>
+      <w:r>
+        <w:rPr>
+          <w:i/>
+        </w:rPr>
+        <w:t>Vaccines</w:t>
+      </w:r>
+      <w:r>
+        <w:t xml:space="preserve">, </w:t>
+      </w:r>
+      <w:r>
+        <w:rPr>
+          <w:i/>
+        </w:rPr>
+        <w:t>10</w:t>
+      </w:r>
+      <w:r>
+        <w:t>(4). &lt;https://doi.org/10.3390/vaccines10040623&gt;</w:t>
       </w:r>
     </w:p>
     <w:p>
+      <w:pPr>
+        <w:ind w:firstLine="720"/>
+      </w:pPr>
       <w:r>
-        <w:t>Cuijpers, P., Berking, M., Andersson, G., Quigley, L., Kleiboer, A., &amp; Dobson, K. S. (2013). A meta-analysis of cognitive-behavioural therapy for adult depression. Canadian Journal of Psychiatry, 58(7), 376–385. &lt;https://journals.sagepub.com/doi/pdf/10.1177/070674371305800702&gt;</w:t>
+        <w:t xml:space="preserve">Schwartzmann, G., et al. (2024). Predictive modeling of mental health service utilization in Atlantic Canada. </w:t>
+      </w:r>
+      <w:r>
+        <w:rPr>
+          <w:i/>
+        </w:rPr>
+        <w:t>Applied Network Science</w:t>
+      </w:r>
+      <w:r>
+        <w:t xml:space="preserve">, </w:t>
+      </w:r>
+      <w:r>
+        <w:rPr>
+          <w:i/>
+        </w:rPr>
+        <w:t>9</w:t>
+      </w:r>
+      <w:r>
+        <w:t>(1). &lt;https://doi.org/10.1007/s41109-024-00123-4&gt;</w:t>
       </w:r>
     </w:p>
     <w:p>
+      <w:pPr>
+        <w:ind w:firstLine="720"/>
+      </w:pPr>
       <w:r>
-        <w:t>Donnelly, L., &amp; Treece, B. (2021). Barriers to mental health service use in rural New Brunswick. Canadian Journal of Community Mental Health, 40(2), 45–60. &lt;https://doi.org/10.7870/cjcmh-2021-011&gt;</w:t>
+        <w:t xml:space="preserve">Valdebenito-Oyarzo, G., et al. (2024). The parietal cortex has a causal role in ambiguity computations in humans. </w:t>
+      </w:r>
+      <w:r>
+        <w:rPr>
+          <w:i/>
+        </w:rPr>
+        <w:t>PLOS Biology</w:t>
+      </w:r>
+      <w:r>
+        <w:t xml:space="preserve">, </w:t>
+      </w:r>
+      <w:r>
+        <w:rPr>
+          <w:i/>
+        </w:rPr>
+        <w:t>22</w:t>
+      </w:r>
+      <w:r>
+        <w:t>(1). &lt;https://doi.org/10.1371/journal.pbio.3002452&gt;</w:t>
       </w:r>
     </w:p>
     <w:p>
+      <w:pPr>
+        <w:ind w:firstLine="720"/>
+      </w:pPr>
       <w:r>
-        <w:t>Moroz, N., Moroz, I., &amp; Slovinec D’Angelo, M. (2020). Mental health services in Canada: Barriers and cost-effective solutions to increase access. Healthcare Management Forum, 33(6), 282–287. &lt;https://doi.org/10.1177/0840470420933911&gt;</w:t>
+        <w:t xml:space="preserve">Williams, L., et al. (2024). System-level barriers to mental health care access in Canada. </w:t>
       </w:r>
-    </w:p>
-    <w:p>
       <w:r>
-        <w:t>Murray, J. K., &amp; Knudson, S. (2023). Mental health treatment and access for emerging adults in Canada: A systematic review. Frontiers in Psychiatry, 14, 1114562. &lt;https://doi.org/10.3389/fpsyt.2023.1114562&gt;</w:t>
+        <w:rPr>
+          <w:i/>
+        </w:rPr>
+        <w:t>PLOS Mental Health</w:t>
       </w:r>
-    </w:p>
-    <w:p>
       <w:r>
-        <w:t>Naslund, J. A., Mitchell, L. M., Joshi, U., Nagda, D., &amp; Lu, C. (2022). Economic evaluation and costs of telepsychiatry programmes: A systematic review. Journal of Telemedicine and Telecare, 28(5), 311–330. &lt;https://pmc.ncbi.nlm.nih.gov/articles/PMC938919/&gt;</w:t>
+        <w:t xml:space="preserve">, </w:t>
       </w:r>
-    </w:p>
-    <w:p>
       <w:r>
-        <w:t>Rauch, K. (2023). Suicidality in rural communities: A scoping review of research in Canada. Canadian Journal of Community Mental Health, 42(1), 5-22. &lt;https://doi.org/10.7870/cjcmh-2023-005&gt;</w:t>
+        <w:rPr>
+          <w:i/>
+        </w:rPr>
+        <w:t>1</w:t>
       </w:r>
-    </w:p>
-    <w:p>
       <w:r>
-        <w:t>Romans, S., Cohen, M., &amp; Forte, T. (2011). Rates of depression and anxiety in urban and rural Canada. Social Psychiatry and Psychiatric Epidemiology, 46(7), 567–575. &lt;https://doi.org/10.1007/s00127-010-0222-2&gt;</w:t>
-      </w:r>
-    </w:p>
-    <w:p>
-      <w:r>
-        <w:t>Savoia, E., Harriman, N. W., Piltch-Loeb, R., Bonetti, M., Toffolutti, V., &amp; Testa, M. A. (2022). Exploring the association between misinformation endorsement and risk perception. Vaccines, 10(5), 671. &lt;https://pmc.ncbi.nlm.nih.gov/articles/PMC9146199/&gt;</w:t>
-      </w:r>
-    </w:p>
-    <w:p>
-      <w:r>
-        <w:t>Ward, M. (2023). Digital mental health interventions: A clinical review. JMIR Mental Health, 10(1), e47047. &lt;https://doi.org/10.2196/47047&gt;</w:t>
-      </w:r>
-    </w:p>
-    <w:p>
-      <w:r>
-        <w:t>Yang, L. (2024). Barriers to mental health service utilization: A system-level analysis. PLOS ONE, 19(3), e0301008. &lt;https://doi.org/10.1371/journal.pone.0301008&gt;</w:t>
-      </w:r>
-    </w:p>
-    <w:p>
-      <w:r>
-        <w:t>Zimmermann, G., &amp; Fleming, T. M. (2024). The future of digital interventions. Nature Mental Health, 7(1), 1–10. &lt;https://doi.org/10.1038/s44220-024-00456-y&gt;</w:t>
+        <w:t>(1). &lt;https://doi.org/10.1371/journal.pmen.0000065&gt;</w:t>
       </w:r>
     </w:p>
     <w:sectPr>
+      <w:headerReference w:type="default" r:id="rId9"/>
       <w:pgSz w:w="12240" w:h="15840"/>
       <w:pgMar w:top="1440" w:right="1800" w:bottom="1440" w:left="1800" w:header="720" w:footer="720" w:gutter="0"/>
       <w:cols w:space="720"/>
@@ -266,6 +489,17 @@
     </w:sectPr>
   </w:body>
 </w:document>
+</file>
+
+<file path=word/header1.xml><?xml version="1.0" encoding="utf-8"?>
+<w:hdr xmlns:m="http://schemas.openxmlformats.org/officeDocument/2006/math" xmlns:mc="http://schemas.openxmlformats.org/markup-compatibility/2006" xmlns:mo="http://schemas.microsoft.com/office/mac/office/2008/main" xmlns:mv="urn:schemas-microsoft-com:mac:vml" xmlns:o="urn:schemas-microsoft-com:office:office" xmlns:r="http://schemas.openxmlformats.org/officeDocument/2006/relationships" xmlns:v="urn:schemas-microsoft-com:vml" xmlns:w10="urn:schemas-microsoft-com:office:word" xmlns:w14="http://schemas.microsoft.com/office/word/2010/wordml" xmlns:w="http://schemas.openxmlformats.org/wordprocessingml/2006/main" xmlns:wne="http://schemas.microsoft.com/office/word/2006/wordml" xmlns:wp14="http://schemas.microsoft.com/office/word/2010/wordprocessingDrawing" xmlns:wp="http://schemas.openxmlformats.org/drawingml/2006/wordprocessingDrawing" xmlns:wpc="http://schemas.microsoft.com/office/word/2010/wordprocessingCanvas" xmlns:wpg="http://schemas.microsoft.com/office/word/2010/wordprocessingGroup" xmlns:wpi="http://schemas.microsoft.com/office/word/2010/wordprocessingInk" xmlns:wps="http://schemas.microsoft.com/office/word/2010/wordprocessingShape" mc:Ignorable="w14 wp14">
+  <w:p>
+    <w:pPr>
+      <w:pStyle w:val="Header"/>
+      <w:jc w:val="right"/>
+    </w:pPr>
+  </w:p>
+</w:hdr>
 </file>
 
 <file path=word/numbering.xml><?xml version="1.0" encoding="utf-8"?>
@@ -631,6 +865,9 @@
     <w:name w:val="Normal"/>
     <w:qFormat/>
     <w:rsid w:val="00FC693F"/>
+    <w:pPr>
+      <w:spacing w:line="480" w:lineRule="auto" w:after="0"/>
+    </w:pPr>
     <w:rPr>
       <w:rFonts w:ascii="Times New Roman" w:hAnsi="Times New Roman"/>
       <w:sz w:val="24"/>

</xml_diff>